<commit_message>
Update: description de la modification
</commit_message>
<xml_diff>
--- a/docs/Detection_Lab_Portfolio.docx
+++ b/docs/Detection_Lab_Portfolio.docx
@@ -88,7 +88,7 @@
           <w:sz w:val="22"/>
           <w:szCs w:val="22"/>
         </w:rPr>
-        <w:t xml:space="preserve">Octobre 2026 | Pile : </w:t>
+        <w:t xml:space="preserve"> Pile : </w:t>
       </w:r>
       <w:proofErr w:type="spellStart"/>
       <w:r>
@@ -299,12 +299,6 @@
         <w:gridCol w:w="2000"/>
       </w:tblGrid>
       <w:tr>
-        <w:tblPrEx>
-          <w:tblCellMar>
-            <w:top w:w="0" w:type="dxa"/>
-            <w:bottom w:w="0" w:type="dxa"/>
-          </w:tblCellMar>
-        </w:tblPrEx>
         <w:trPr>
           <w:tblHeader/>
         </w:trPr>
@@ -414,12 +408,6 @@
         </w:tc>
       </w:tr>
       <w:tr>
-        <w:tblPrEx>
-          <w:tblCellMar>
-            <w:top w:w="0" w:type="dxa"/>
-            <w:bottom w:w="0" w:type="dxa"/>
-          </w:tblCellMar>
-        </w:tblPrEx>
         <w:tc>
           <w:tcPr>
             <w:tcW w:w="2200" w:type="dxa"/>
@@ -494,12 +482,6 @@
         </w:tc>
       </w:tr>
       <w:tr>
-        <w:tblPrEx>
-          <w:tblCellMar>
-            <w:top w:w="0" w:type="dxa"/>
-            <w:bottom w:w="0" w:type="dxa"/>
-          </w:tblCellMar>
-        </w:tblPrEx>
         <w:tc>
           <w:tcPr>
             <w:tcW w:w="2200" w:type="dxa"/>
@@ -570,12 +552,6 @@
         </w:tc>
       </w:tr>
       <w:tr>
-        <w:tblPrEx>
-          <w:tblCellMar>
-            <w:top w:w="0" w:type="dxa"/>
-            <w:bottom w:w="0" w:type="dxa"/>
-          </w:tblCellMar>
-        </w:tblPrEx>
         <w:tc>
           <w:tcPr>
             <w:tcW w:w="2200" w:type="dxa"/>
@@ -1146,12 +1122,6 @@
         <w:gridCol w:w="2900"/>
       </w:tblGrid>
       <w:tr>
-        <w:tblPrEx>
-          <w:tblCellMar>
-            <w:top w:w="0" w:type="dxa"/>
-            <w:bottom w:w="0" w:type="dxa"/>
-          </w:tblCellMar>
-        </w:tblPrEx>
         <w:trPr>
           <w:tblHeader/>
         </w:trPr>
@@ -1287,12 +1257,6 @@
         </w:tc>
       </w:tr>
       <w:tr>
-        <w:tblPrEx>
-          <w:tblCellMar>
-            <w:top w:w="0" w:type="dxa"/>
-            <w:bottom w:w="0" w:type="dxa"/>
-          </w:tblCellMar>
-        </w:tblPrEx>
         <w:tc>
           <w:tcPr>
             <w:tcW w:w="1700" w:type="dxa"/>
@@ -1375,12 +1339,6 @@
         </w:tc>
       </w:tr>
       <w:tr>
-        <w:tblPrEx>
-          <w:tblCellMar>
-            <w:top w:w="0" w:type="dxa"/>
-            <w:bottom w:w="0" w:type="dxa"/>
-          </w:tblCellMar>
-        </w:tblPrEx>
         <w:tc>
           <w:tcPr>
             <w:tcW w:w="1700" w:type="dxa"/>
@@ -1484,12 +1442,6 @@
         </w:tc>
       </w:tr>
       <w:tr>
-        <w:tblPrEx>
-          <w:tblCellMar>
-            <w:top w:w="0" w:type="dxa"/>
-            <w:bottom w:w="0" w:type="dxa"/>
-          </w:tblCellMar>
-        </w:tblPrEx>
         <w:tc>
           <w:tcPr>
             <w:tcW w:w="1700" w:type="dxa"/>
@@ -1577,12 +1529,6 @@
         </w:tc>
       </w:tr>
       <w:tr>
-        <w:tblPrEx>
-          <w:tblCellMar>
-            <w:top w:w="0" w:type="dxa"/>
-            <w:bottom w:w="0" w:type="dxa"/>
-          </w:tblCellMar>
-        </w:tblPrEx>
         <w:tc>
           <w:tcPr>
             <w:tcW w:w="1700" w:type="dxa"/>
@@ -1678,12 +1624,6 @@
         </w:tc>
       </w:tr>
       <w:tr>
-        <w:tblPrEx>
-          <w:tblCellMar>
-            <w:top w:w="0" w:type="dxa"/>
-            <w:bottom w:w="0" w:type="dxa"/>
-          </w:tblCellMar>
-        </w:tblPrEx>
         <w:tc>
           <w:tcPr>
             <w:tcW w:w="1700" w:type="dxa"/>
@@ -1774,12 +1714,6 @@
         </w:tc>
       </w:tr>
       <w:tr>
-        <w:tblPrEx>
-          <w:tblCellMar>
-            <w:top w:w="0" w:type="dxa"/>
-            <w:bottom w:w="0" w:type="dxa"/>
-          </w:tblCellMar>
-        </w:tblPrEx>
         <w:tc>
           <w:tcPr>
             <w:tcW w:w="1700" w:type="dxa"/>
@@ -1880,12 +1814,6 @@
         </w:tc>
       </w:tr>
       <w:tr>
-        <w:tblPrEx>
-          <w:tblCellMar>
-            <w:top w:w="0" w:type="dxa"/>
-            <w:bottom w:w="0" w:type="dxa"/>
-          </w:tblCellMar>
-        </w:tblPrEx>
         <w:tc>
           <w:tcPr>
             <w:tcW w:w="1700" w:type="dxa"/>
@@ -2014,12 +1942,6 @@
         <w:gridCol w:w="2552"/>
       </w:tblGrid>
       <w:tr>
-        <w:tblPrEx>
-          <w:tblCellMar>
-            <w:top w:w="0" w:type="dxa"/>
-            <w:bottom w:w="0" w:type="dxa"/>
-          </w:tblCellMar>
-        </w:tblPrEx>
         <w:trPr>
           <w:tblHeader/>
         </w:trPr>
@@ -2129,12 +2051,6 @@
         </w:tc>
       </w:tr>
       <w:tr>
-        <w:tblPrEx>
-          <w:tblCellMar>
-            <w:top w:w="0" w:type="dxa"/>
-            <w:bottom w:w="0" w:type="dxa"/>
-          </w:tblCellMar>
-        </w:tblPrEx>
         <w:tc>
           <w:tcPr>
             <w:tcW w:w="600" w:type="dxa"/>
@@ -2209,12 +2125,6 @@
         </w:tc>
       </w:tr>
       <w:tr>
-        <w:tblPrEx>
-          <w:tblCellMar>
-            <w:top w:w="0" w:type="dxa"/>
-            <w:bottom w:w="0" w:type="dxa"/>
-          </w:tblCellMar>
-        </w:tblPrEx>
         <w:tc>
           <w:tcPr>
             <w:tcW w:w="600" w:type="dxa"/>
@@ -2290,12 +2200,6 @@
         </w:tc>
       </w:tr>
       <w:tr>
-        <w:tblPrEx>
-          <w:tblCellMar>
-            <w:top w:w="0" w:type="dxa"/>
-            <w:bottom w:w="0" w:type="dxa"/>
-          </w:tblCellMar>
-        </w:tblPrEx>
         <w:tc>
           <w:tcPr>
             <w:tcW w:w="600" w:type="dxa"/>
@@ -2369,12 +2273,6 @@
         </w:tc>
       </w:tr>
       <w:tr>
-        <w:tblPrEx>
-          <w:tblCellMar>
-            <w:top w:w="0" w:type="dxa"/>
-            <w:bottom w:w="0" w:type="dxa"/>
-          </w:tblCellMar>
-        </w:tblPrEx>
         <w:tc>
           <w:tcPr>
             <w:tcW w:w="600" w:type="dxa"/>
@@ -2453,12 +2351,6 @@
         </w:tc>
       </w:tr>
       <w:tr>
-        <w:tblPrEx>
-          <w:tblCellMar>
-            <w:top w:w="0" w:type="dxa"/>
-            <w:bottom w:w="0" w:type="dxa"/>
-          </w:tblCellMar>
-        </w:tblPrEx>
         <w:tc>
           <w:tcPr>
             <w:tcW w:w="600" w:type="dxa"/>

</xml_diff>